<commit_message>
añadi el cambio de la 4 funcion de algoritmo
</commit_message>
<xml_diff>
--- a/Algoritmo Logica y estructura discreta.docx
+++ b/Algoritmo Logica y estructura discreta.docx
@@ -1,6 +1,6 @@
 
 <file path=word/document.xml><?xml version="1.0" encoding="utf-8"?>
-<w:document xmlns:wpc="http://schemas.microsoft.com/office/word/2010/wordprocessingCanvas" xmlns:cx="http://schemas.microsoft.com/office/drawing/2014/chartex" xmlns:mc="http://schemas.openxmlformats.org/markup-compatibility/2006" xmlns:o="urn:schemas-microsoft-com:office:office" xmlns:r="http://schemas.openxmlformats.org/officeDocument/2006/relationships" xmlns:m="http://schemas.openxmlformats.org/officeDocument/2006/math" xmlns:v="urn:schemas-microsoft-com:vml" xmlns:wp14="http://schemas.microsoft.com/office/word/2010/wordprocessingDrawing" xmlns:wp="http://schemas.openxmlformats.org/drawingml/2006/wordprocessingDrawing" xmlns:w10="urn:schemas-microsoft-com:office:word" xmlns:w="http://schemas.openxmlformats.org/wordprocessingml/2006/main" xmlns:w14="http://schemas.microsoft.com/office/word/2010/wordml" xmlns:w15="http://schemas.microsoft.com/office/word/2012/wordml" xmlns:w16se="http://schemas.microsoft.com/office/word/2015/wordml/symex" xmlns:wpg="http://schemas.microsoft.com/office/word/2010/wordprocessingGroup" xmlns:wpi="http://schemas.microsoft.com/office/word/2010/wordprocessingInk" xmlns:wne="http://schemas.microsoft.com/office/word/2006/wordml" xmlns:wps="http://schemas.microsoft.com/office/word/2010/wordprocessingShape" mc:Ignorable="w14 w15 w16se wp14">
+<w:document xmlns:wpc="http://schemas.microsoft.com/office/word/2010/wordprocessingCanvas" xmlns:cx="http://schemas.microsoft.com/office/drawing/2014/chartex" xmlns:cx1="http://schemas.microsoft.com/office/drawing/2015/9/8/chartex" xmlns:cx2="http://schemas.microsoft.com/office/drawing/2015/10/21/chartex" xmlns:cx3="http://schemas.microsoft.com/office/drawing/2016/5/9/chartex" xmlns:cx4="http://schemas.microsoft.com/office/drawing/2016/5/10/chartex" xmlns:cx5="http://schemas.microsoft.com/office/drawing/2016/5/11/chartex" xmlns:cx6="http://schemas.microsoft.com/office/drawing/2016/5/12/chartex" xmlns:cx7="http://schemas.microsoft.com/office/drawing/2016/5/13/chartex" xmlns:cx8="http://schemas.microsoft.com/office/drawing/2016/5/14/chartex" xmlns:mc="http://schemas.openxmlformats.org/markup-compatibility/2006" xmlns:aink="http://schemas.microsoft.com/office/drawing/2016/ink" xmlns:am3d="http://schemas.microsoft.com/office/drawing/2017/model3d" xmlns:o="urn:schemas-microsoft-com:office:office" xmlns:oel="http://schemas.microsoft.com/office/2019/extlst" xmlns:r="http://schemas.openxmlformats.org/officeDocument/2006/relationships" xmlns:m="http://schemas.openxmlformats.org/officeDocument/2006/math" xmlns:v="urn:schemas-microsoft-com:vml" xmlns:wp14="http://schemas.microsoft.com/office/word/2010/wordprocessingDrawing" xmlns:wp="http://schemas.openxmlformats.org/drawingml/2006/wordprocessingDrawing" xmlns:w10="urn:schemas-microsoft-com:office:word" xmlns:w="http://schemas.openxmlformats.org/wordprocessingml/2006/main" xmlns:w14="http://schemas.microsoft.com/office/word/2010/wordml" xmlns:w15="http://schemas.microsoft.com/office/word/2012/wordml" xmlns:w16cex="http://schemas.microsoft.com/office/word/2018/wordml/cex" xmlns:w16cid="http://schemas.microsoft.com/office/word/2016/wordml/cid" xmlns:w16="http://schemas.microsoft.com/office/word/2018/wordml" xmlns:w16du="http://schemas.microsoft.com/office/word/2023/wordml/word16du" xmlns:w16sdtdh="http://schemas.microsoft.com/office/word/2020/wordml/sdtdatahash" xmlns:w16sdtfl="http://schemas.microsoft.com/office/word/2024/wordml/sdtformatlock" xmlns:w16se="http://schemas.microsoft.com/office/word/2015/wordml/symex" xmlns:wpg="http://schemas.microsoft.com/office/word/2010/wordprocessingGroup" xmlns:wpi="http://schemas.microsoft.com/office/word/2010/wordprocessingInk" xmlns:wne="http://schemas.microsoft.com/office/word/2006/wordml" xmlns:wps="http://schemas.microsoft.com/office/word/2010/wordprocessingShape" mc:Ignorable="w14 w15 w16se w16cid w16 w16cex w16sdtdh w16sdtfl w16du wp14">
   <w:body>
     <w:p/>
     <w:p/>
@@ -104,13 +104,382 @@
       <w:pPr>
         <w:pStyle w:val="Prrafodelista"/>
       </w:pPr>
+      <w:r>
+        <w:t xml:space="preserve">Bicondicional (↔) </w:t>
+      </w:r>
+    </w:p>
+    <w:p>
+      <w:pPr>
+        <w:pStyle w:val="Prrafodelista"/>
+      </w:pPr>
+      <w:r>
+        <w:t>XOR (O Exclusivo)</w:t>
+      </w:r>
+    </w:p>
+    <w:p>
+      <w:pPr>
+        <w:ind w:left="360"/>
+      </w:pPr>
+    </w:p>
+    <w:p>
+      <w:pPr>
+        <w:ind w:left="360"/>
+      </w:pPr>
+    </w:p>
+    <w:p>
+      <w:pPr>
+        <w:pStyle w:val="Prrafodelista"/>
+        <w:numPr>
+          <w:ilvl w:val="0"/>
+          <w:numId w:val="1"/>
+        </w:numPr>
+      </w:pPr>
+      <w:r>
+        <w:t>Crear tres funciones para el programa, la primera para formato textual, la segunda con valores de verdad y la tercera para el videojuego</w:t>
+      </w:r>
+    </w:p>
+    <w:p/>
+    <w:p>
+      <w:pPr>
+        <w:pStyle w:val="Prrafodelista"/>
+        <w:numPr>
+          <w:ilvl w:val="0"/>
+          <w:numId w:val="1"/>
+        </w:numPr>
+      </w:pPr>
+      <w:r>
+        <w:t>Para la primera función …</w:t>
+      </w:r>
+    </w:p>
+    <w:p>
+      <w:pPr>
+        <w:pStyle w:val="Prrafodelista"/>
+      </w:pPr>
+    </w:p>
+    <w:p>
+      <w:pPr>
+        <w:pStyle w:val="Prrafodelista"/>
+        <w:numPr>
+          <w:ilvl w:val="1"/>
+          <w:numId w:val="1"/>
+        </w:numPr>
+      </w:pPr>
+      <w:r>
+        <w:t xml:space="preserve">Pedir al usuario los valores de las variables </w:t>
+      </w:r>
+      <w:r>
+        <w:t>(p</w:t>
+      </w:r>
+      <w:r>
+        <w:t>, q)</w:t>
+      </w:r>
+    </w:p>
+    <w:p>
+      <w:pPr>
+        <w:pStyle w:val="Prrafodelista"/>
+        <w:numPr>
+          <w:ilvl w:val="1"/>
+          <w:numId w:val="1"/>
+        </w:numPr>
+      </w:pPr>
+      <w:r>
+        <w:t xml:space="preserve">Dar a elegir al usuario con que operador quiere manejar </w:t>
+      </w:r>
       <w:proofErr w:type="spellStart"/>
       <w:r>
-        <w:t>Bicondicional</w:t>
+        <w:t>int</w:t>
       </w:r>
       <w:proofErr w:type="spellEnd"/>
       <w:r>
-        <w:t xml:space="preserve"> (↔) </w:t>
+        <w:t xml:space="preserve">(input)) </w:t>
+      </w:r>
+    </w:p>
+    <w:p>
+      <w:pPr>
+        <w:pStyle w:val="Prrafodelista"/>
+        <w:numPr>
+          <w:ilvl w:val="1"/>
+          <w:numId w:val="1"/>
+        </w:numPr>
+      </w:pPr>
+      <w:r>
+        <w:t>Imprimir las variables junto con su operador (Ejemplo: “</w:t>
+      </w:r>
+      <w:proofErr w:type="spellStart"/>
+      <w:r>
+        <w:t>p^q</w:t>
+      </w:r>
+      <w:proofErr w:type="spellEnd"/>
+      <w:r>
+        <w:t xml:space="preserve"> = esta nublado y frio”).</w:t>
+      </w:r>
+    </w:p>
+    <w:p/>
+    <w:p>
+      <w:pPr>
+        <w:pStyle w:val="Prrafodelista"/>
+        <w:numPr>
+          <w:ilvl w:val="0"/>
+          <w:numId w:val="1"/>
+        </w:numPr>
+      </w:pPr>
+      <w:r>
+        <w:t>Para la segunda función…</w:t>
+      </w:r>
+    </w:p>
+    <w:p>
+      <w:pPr>
+        <w:pStyle w:val="Prrafodelista"/>
+        <w:numPr>
+          <w:ilvl w:val="1"/>
+          <w:numId w:val="1"/>
+        </w:numPr>
+      </w:pPr>
+      <w:r>
+        <w:t>Pedirle al usuario si p es verdadero o falso (1 para verdadero o 0 para falso)</w:t>
+      </w:r>
+    </w:p>
+    <w:p>
+      <w:pPr>
+        <w:pStyle w:val="Prrafodelista"/>
+        <w:numPr>
+          <w:ilvl w:val="1"/>
+          <w:numId w:val="1"/>
+        </w:numPr>
+      </w:pPr>
+      <w:r>
+        <w:t>Pedirle al usuario si q es verdadero o falso (1 para verdadero o 0 para falso)</w:t>
+      </w:r>
+    </w:p>
+    <w:p>
+      <w:pPr>
+        <w:pStyle w:val="Prrafodelista"/>
+        <w:numPr>
+          <w:ilvl w:val="1"/>
+          <w:numId w:val="1"/>
+        </w:numPr>
+      </w:pPr>
+      <w:r>
+        <w:t>Pedirle el operador con el que desea comprobar.</w:t>
+      </w:r>
+    </w:p>
+    <w:p>
+      <w:pPr>
+        <w:pStyle w:val="Prrafodelista"/>
+        <w:numPr>
+          <w:ilvl w:val="1"/>
+          <w:numId w:val="1"/>
+        </w:numPr>
+      </w:pPr>
+      <w:r>
+        <w:t xml:space="preserve">Para </w:t>
+      </w:r>
+      <w:r>
+        <w:t>conjunción:</w:t>
+      </w:r>
+      <w:r>
+        <w:t xml:space="preserve"> si p</w:t>
+      </w:r>
+      <w:r>
+        <w:t xml:space="preserve"> = 1 y q=1, entonces es verdadero, de lo </w:t>
+      </w:r>
+      <w:proofErr w:type="gramStart"/>
+      <w:r>
+        <w:t>contrario ,</w:t>
+      </w:r>
+      <w:proofErr w:type="gramEnd"/>
+      <w:r>
+        <w:t xml:space="preserve"> es falso</w:t>
+      </w:r>
+    </w:p>
+    <w:p>
+      <w:pPr>
+        <w:pStyle w:val="Prrafodelista"/>
+        <w:numPr>
+          <w:ilvl w:val="1"/>
+          <w:numId w:val="1"/>
+        </w:numPr>
+      </w:pPr>
+      <w:r>
+        <w:t>Para la Disyunción: si p=0 y q=0, entonces es falso, de lo cont7rario, es verdadero</w:t>
+      </w:r>
+    </w:p>
+    <w:p>
+      <w:pPr>
+        <w:pStyle w:val="Prrafodelista"/>
+        <w:numPr>
+          <w:ilvl w:val="1"/>
+          <w:numId w:val="1"/>
+        </w:numPr>
+      </w:pPr>
+      <w:r>
+        <w:t>Para condicional si p=1 y q=</w:t>
+      </w:r>
+      <w:proofErr w:type="gramStart"/>
+      <w:r>
+        <w:t>0  O</w:t>
+      </w:r>
+      <w:proofErr w:type="gramEnd"/>
+      <w:r>
+        <w:t xml:space="preserve"> p=0 y q=</w:t>
+      </w:r>
+      <w:proofErr w:type="gramStart"/>
+      <w:r>
+        <w:t>1,entonces</w:t>
+      </w:r>
+      <w:proofErr w:type="gramEnd"/>
+      <w:r>
+        <w:t xml:space="preserve"> es verdadero, de lo contrario, es falso</w:t>
+      </w:r>
+    </w:p>
+    <w:p>
+      <w:pPr>
+        <w:pStyle w:val="Prrafodelista"/>
+        <w:numPr>
+          <w:ilvl w:val="1"/>
+          <w:numId w:val="1"/>
+        </w:numPr>
+      </w:pPr>
+      <w:r>
+        <w:t xml:space="preserve">Para bicondicional: Si tanto p como q son 0 o 1 es verdadero, de lo contrario es falso </w:t>
+      </w:r>
+    </w:p>
+    <w:p>
+      <w:pPr>
+        <w:pStyle w:val="Prrafodelista"/>
+        <w:numPr>
+          <w:ilvl w:val="1"/>
+          <w:numId w:val="1"/>
+        </w:numPr>
+      </w:pPr>
+      <w:r>
+        <w:t>Para XOR: Si p=</w:t>
+      </w:r>
+      <w:proofErr w:type="gramStart"/>
+      <w:r>
+        <w:t>1,q</w:t>
+      </w:r>
+      <w:proofErr w:type="gramEnd"/>
+      <w:r>
+        <w:t>=0 o p=</w:t>
+      </w:r>
+      <w:proofErr w:type="gramStart"/>
+      <w:r>
+        <w:t>0,q</w:t>
+      </w:r>
+      <w:proofErr w:type="gramEnd"/>
+      <w:r>
+        <w:t>=1 es verdadero, de lo contrario, es falso</w:t>
+      </w:r>
+    </w:p>
+    <w:p>
+      <w:pPr>
+        <w:pStyle w:val="Prrafodelista"/>
+        <w:numPr>
+          <w:ilvl w:val="1"/>
+          <w:numId w:val="1"/>
+        </w:numPr>
+      </w:pPr>
+      <w:r>
+        <w:t>Imprimir resultado</w:t>
+      </w:r>
+    </w:p>
+    <w:p/>
+    <w:p/>
+    <w:p>
+      <w:pPr>
+        <w:pStyle w:val="Prrafodelista"/>
+        <w:numPr>
+          <w:ilvl w:val="0"/>
+          <w:numId w:val="1"/>
+        </w:numPr>
+      </w:pPr>
+      <w:r>
+        <w:t xml:space="preserve">Para la tercera función </w:t>
+      </w:r>
+    </w:p>
+    <w:p>
+      <w:pPr>
+        <w:ind w:left="360"/>
+      </w:pPr>
+    </w:p>
+    <w:p>
+      <w:pPr>
+        <w:pStyle w:val="Prrafodelista"/>
+        <w:numPr>
+          <w:ilvl w:val="1"/>
+          <w:numId w:val="1"/>
+        </w:numPr>
+      </w:pPr>
+    </w:p>
+    <w:p>
+      <w:pPr>
+        <w:pStyle w:val="Prrafodelista"/>
+      </w:pPr>
+      <w:r>
+        <w:t xml:space="preserve">Crear una función por cada operador </w:t>
+      </w:r>
+      <w:proofErr w:type="gramStart"/>
+      <w:r>
+        <w:t>lógico ,</w:t>
+      </w:r>
+      <w:proofErr w:type="gramEnd"/>
+      <w:r>
+        <w:t xml:space="preserve"> </w:t>
+      </w:r>
+      <w:r>
+        <w:t>Conjunción (</w:t>
+      </w:r>
+      <w:r>
+        <w:rPr>
+          <w:rFonts w:ascii="Cambria Math" w:hAnsi="Cambria Math" w:cs="Cambria Math"/>
+        </w:rPr>
+        <w:t>^</w:t>
+      </w:r>
+      <w:r>
+        <w:t xml:space="preserve">) </w:t>
+      </w:r>
+    </w:p>
+    <w:p>
+      <w:pPr>
+        <w:pStyle w:val="Prrafodelista"/>
+      </w:pPr>
+      <w:r>
+        <w:lastRenderedPageBreak/>
+        <w:t>Disyunción (</w:t>
+      </w:r>
+      <w:r>
+        <w:rPr>
+          <w:rFonts w:ascii="Cambria Math" w:hAnsi="Cambria Math" w:cs="Cambria Math"/>
+        </w:rPr>
+        <w:t>∨</w:t>
+      </w:r>
+      <w:r>
+        <w:t xml:space="preserve">) </w:t>
+      </w:r>
+    </w:p>
+    <w:p>
+      <w:pPr>
+        <w:pStyle w:val="Prrafodelista"/>
+      </w:pPr>
+      <w:r>
+        <w:t xml:space="preserve">Negación (¬) </w:t>
+      </w:r>
+    </w:p>
+    <w:p>
+      <w:pPr>
+        <w:pStyle w:val="Prrafodelista"/>
+      </w:pPr>
+      <w:r>
+        <w:t xml:space="preserve">Condicional (→) </w:t>
+      </w:r>
+    </w:p>
+    <w:p>
+      <w:pPr>
+        <w:pStyle w:val="Prrafodelista"/>
+      </w:pPr>
+      <w:r>
+        <w:t xml:space="preserve">Bicondicional (↔) </w:t>
       </w:r>
     </w:p>
     <w:p>
@@ -123,265 +492,815 @@
     </w:p>
     <w:p>
       <w:pPr>
-        <w:ind w:left="360"/>
-      </w:pPr>
-    </w:p>
-    <w:p>
-      <w:pPr>
-        <w:ind w:left="360"/>
-      </w:pPr>
-    </w:p>
-    <w:p>
-      <w:pPr>
-        <w:pStyle w:val="Prrafodelista"/>
-        <w:numPr>
-          <w:ilvl w:val="0"/>
-          <w:numId w:val="1"/>
-        </w:numPr>
-      </w:pPr>
-      <w:r>
-        <w:t>Crear tres funciones para el programa, la primera para formato textual, la segunda con valores de verdad y la tercera para el videojuego</w:t>
-      </w:r>
-    </w:p>
-    <w:p/>
-    <w:p>
-      <w:pPr>
-        <w:pStyle w:val="Prrafodelista"/>
-        <w:numPr>
-          <w:ilvl w:val="0"/>
-          <w:numId w:val="1"/>
-        </w:numPr>
-      </w:pPr>
-      <w:r>
-        <w:t>Para la primera función …</w:t>
-      </w:r>
-    </w:p>
-    <w:p>
-      <w:pPr>
-        <w:pStyle w:val="Prrafodelista"/>
-      </w:pPr>
-    </w:p>
-    <w:p>
-      <w:pPr>
-        <w:pStyle w:val="Prrafodelista"/>
-        <w:numPr>
-          <w:ilvl w:val="1"/>
-          <w:numId w:val="1"/>
-        </w:numPr>
-      </w:pPr>
-      <w:r>
-        <w:t xml:space="preserve">Pedir al usuario los valores de las variables </w:t>
-      </w:r>
-      <w:r>
-        <w:t>(p</w:t>
-      </w:r>
-      <w:r>
-        <w:t>, q)</w:t>
-      </w:r>
-    </w:p>
-    <w:p>
-      <w:pPr>
-        <w:pStyle w:val="Prrafodelista"/>
-        <w:numPr>
-          <w:ilvl w:val="1"/>
-          <w:numId w:val="1"/>
-        </w:numPr>
-      </w:pPr>
-      <w:r>
-        <w:t xml:space="preserve">Dar a elegir al usuario con que operador quiere manejar </w:t>
+        <w:pStyle w:val="Prrafodelista"/>
+        <w:numPr>
+          <w:ilvl w:val="1"/>
+          <w:numId w:val="1"/>
+        </w:numPr>
+      </w:pPr>
+      <w:r>
+        <w:t>. opcion</w:t>
+      </w:r>
+      <w:proofErr w:type="gramStart"/>
+      <w:r>
+        <w:t>1 ,</w:t>
+      </w:r>
+      <w:proofErr w:type="gramEnd"/>
+      <w:r>
+        <w:t xml:space="preserve"> crear una función que determine </w:t>
       </w:r>
       <w:proofErr w:type="spellStart"/>
       <w:r>
-        <w:t>int</w:t>
+        <w:t>que</w:t>
       </w:r>
       <w:proofErr w:type="spellEnd"/>
       <w:r>
-        <w:t xml:space="preserve">(input)) </w:t>
-      </w:r>
-    </w:p>
-    <w:p>
-      <w:pPr>
-        <w:pStyle w:val="Prrafodelista"/>
-        <w:numPr>
-          <w:ilvl w:val="1"/>
-          <w:numId w:val="1"/>
-        </w:numPr>
-      </w:pPr>
-      <w:r>
-        <w:t>Imprimir las variables junto con su operador (Ejemplo: “</w:t>
+        <w:t xml:space="preserve"> tipo de operador es y llamar a las funciones antes creadas</w:t>
+      </w:r>
+    </w:p>
+    <w:p>
+      <w:pPr>
+        <w:pStyle w:val="Prrafodelista"/>
+        <w:numPr>
+          <w:ilvl w:val="1"/>
+          <w:numId w:val="1"/>
+        </w:numPr>
+      </w:pPr>
+      <w:r>
+        <w:t>Opcion2 llamar a las funcione y usar condicionantes dependiendo de lo que el usuario ingrese.</w:t>
+      </w:r>
+    </w:p>
+    <w:p>
+      <w:pPr>
+        <w:pStyle w:val="Prrafodelista"/>
+        <w:numPr>
+          <w:ilvl w:val="1"/>
+          <w:numId w:val="1"/>
+        </w:numPr>
+      </w:pPr>
+      <w:r>
+        <w:t>Pedir,</w:t>
+      </w:r>
+      <w:r>
+        <w:t xml:space="preserve"> al usuario </w:t>
+      </w:r>
+      <w:proofErr w:type="gramStart"/>
+      <w:r>
+        <w:t>1 ,</w:t>
+      </w:r>
+      <w:proofErr w:type="gramEnd"/>
+      <w:r>
+        <w:t xml:space="preserve"> los operadores lógicos a usar </w:t>
+      </w:r>
+    </w:p>
+    <w:p>
+      <w:pPr>
+        <w:pStyle w:val="Prrafodelista"/>
+        <w:numPr>
+          <w:ilvl w:val="1"/>
+          <w:numId w:val="1"/>
+        </w:numPr>
+      </w:pPr>
+      <w:r>
+        <w:t xml:space="preserve">Reiniciar </w:t>
+      </w:r>
+      <w:proofErr w:type="gramStart"/>
+      <w:r>
+        <w:t>interfaz ,</w:t>
+      </w:r>
+      <w:proofErr w:type="gramEnd"/>
+      <w:r>
+        <w:t xml:space="preserve"> para que el usuario dos no vea los operadores puestos por el usuario 1</w:t>
+      </w:r>
+    </w:p>
+    <w:p>
+      <w:pPr>
+        <w:pStyle w:val="Prrafodelista"/>
+        <w:numPr>
+          <w:ilvl w:val="1"/>
+          <w:numId w:val="1"/>
+        </w:numPr>
+      </w:pPr>
+      <w:r>
+        <w:t xml:space="preserve">Pedir los valores de </w:t>
+      </w:r>
+      <w:proofErr w:type="gramStart"/>
+      <w:r>
+        <w:t>verdad  al</w:t>
+      </w:r>
+      <w:proofErr w:type="gramEnd"/>
+      <w:r>
+        <w:t xml:space="preserve"> usuario 2 </w:t>
+      </w:r>
+    </w:p>
+    <w:p>
+      <w:pPr>
+        <w:pStyle w:val="Prrafodelista"/>
+        <w:numPr>
+          <w:ilvl w:val="1"/>
+          <w:numId w:val="1"/>
+        </w:numPr>
+      </w:pPr>
+      <w:r>
+        <w:t xml:space="preserve">Imprimir el resultado </w:t>
       </w:r>
       <w:proofErr w:type="spellStart"/>
       <w:r>
-        <w:t>p^q</w:t>
+        <w:t>boleano</w:t>
       </w:r>
       <w:proofErr w:type="spellEnd"/>
       <w:r>
-        <w:t xml:space="preserve"> = esta nublado y frio”).</w:t>
-      </w:r>
-    </w:p>
-    <w:p/>
-    <w:p>
-      <w:pPr>
-        <w:pStyle w:val="Prrafodelista"/>
-        <w:numPr>
-          <w:ilvl w:val="0"/>
-          <w:numId w:val="1"/>
-        </w:numPr>
-      </w:pPr>
-      <w:r>
-        <w:t>Para la segunda función…</w:t>
-      </w:r>
-    </w:p>
-    <w:p>
-      <w:pPr>
-        <w:pStyle w:val="Prrafodelista"/>
-        <w:numPr>
-          <w:ilvl w:val="1"/>
-          <w:numId w:val="1"/>
-        </w:numPr>
-      </w:pPr>
-      <w:r>
-        <w:t>Pedirle al usuario si p es verdadero o falso (1 para verdadero o 0 para falso)</w:t>
-      </w:r>
-    </w:p>
-    <w:p>
-      <w:pPr>
-        <w:pStyle w:val="Prrafodelista"/>
-        <w:numPr>
-          <w:ilvl w:val="1"/>
-          <w:numId w:val="1"/>
-        </w:numPr>
-      </w:pPr>
-      <w:r>
-        <w:t>Pedirle al usuario si q es verdadero o falso (1 para verdadero o 0 para falso)</w:t>
-      </w:r>
-    </w:p>
-    <w:p>
-      <w:pPr>
-        <w:pStyle w:val="Prrafodelista"/>
-        <w:numPr>
-          <w:ilvl w:val="1"/>
-          <w:numId w:val="1"/>
-        </w:numPr>
-      </w:pPr>
-      <w:r>
-        <w:t>Pedirle el operador con el que desea comprobar.</w:t>
-      </w:r>
-    </w:p>
-    <w:p>
-      <w:pPr>
-        <w:pStyle w:val="Prrafodelista"/>
-        <w:numPr>
-          <w:ilvl w:val="1"/>
-          <w:numId w:val="1"/>
-        </w:numPr>
-      </w:pPr>
-      <w:r>
-        <w:t xml:space="preserve">Para </w:t>
-      </w:r>
-      <w:r>
-        <w:t>conjunción:</w:t>
-      </w:r>
-      <w:r>
-        <w:t xml:space="preserve"> si p</w:t>
-      </w:r>
-      <w:r>
-        <w:t xml:space="preserve"> = 1 y q=1, entonces es verdadero, de lo </w:t>
-      </w:r>
-      <w:proofErr w:type="gramStart"/>
-      <w:r>
-        <w:t>contrario ,</w:t>
-      </w:r>
-      <w:proofErr w:type="gramEnd"/>
-      <w:r>
-        <w:t xml:space="preserve"> es falso</w:t>
-      </w:r>
-    </w:p>
-    <w:p>
-      <w:pPr>
-        <w:pStyle w:val="Prrafodelista"/>
-        <w:numPr>
-          <w:ilvl w:val="1"/>
-          <w:numId w:val="1"/>
-        </w:numPr>
-      </w:pPr>
-      <w:r>
-        <w:t>Para la Disyunción: si p=0 y q=0, entonces es falso, de lo cont7rario, es verdadero</w:t>
-      </w:r>
-    </w:p>
-    <w:p>
-      <w:pPr>
-        <w:pStyle w:val="Prrafodelista"/>
-        <w:numPr>
-          <w:ilvl w:val="1"/>
-          <w:numId w:val="1"/>
-        </w:numPr>
-      </w:pPr>
-      <w:r>
-        <w:t>Para condicional si p=1 y q=</w:t>
-      </w:r>
-      <w:proofErr w:type="gramStart"/>
-      <w:r>
-        <w:t>0  O</w:t>
-      </w:r>
-      <w:proofErr w:type="gramEnd"/>
-      <w:r>
-        <w:t xml:space="preserve"> p=0 y q=1,entonces es verdadero, de lo contrario, es falso</w:t>
-      </w:r>
-    </w:p>
-    <w:p>
-      <w:pPr>
-        <w:pStyle w:val="Prrafodelista"/>
-        <w:numPr>
-          <w:ilvl w:val="1"/>
-          <w:numId w:val="1"/>
-        </w:numPr>
-      </w:pPr>
-      <w:r>
-        <w:t xml:space="preserve">Para </w:t>
-      </w:r>
+        <w:t xml:space="preserve"> verdadero o falso del usuario 2 </w:t>
+      </w:r>
+    </w:p>
+    <w:p>
+      <w:pPr>
+        <w:pStyle w:val="Prrafodelista"/>
+        <w:numPr>
+          <w:ilvl w:val="1"/>
+          <w:numId w:val="1"/>
+        </w:numPr>
+      </w:pPr>
+      <w:r>
+        <w:t>Inicializar un contador de movimientos</w:t>
+      </w:r>
+    </w:p>
+    <w:p>
+      <w:pPr>
+        <w:pStyle w:val="Prrafodelista"/>
+        <w:numPr>
+          <w:ilvl w:val="1"/>
+          <w:numId w:val="1"/>
+        </w:numPr>
+      </w:pPr>
+      <w:r>
+        <w:t xml:space="preserve">Iniciar un bucle mientras el contador no sea mayor que el limite establecido </w:t>
+      </w:r>
+    </w:p>
+    <w:p>
+      <w:pPr>
+        <w:pStyle w:val="Prrafodelista"/>
+        <w:numPr>
+          <w:ilvl w:val="1"/>
+          <w:numId w:val="1"/>
+        </w:numPr>
+      </w:pPr>
+    </w:p>
+    <w:p>
+      <w:pPr>
+        <w:pStyle w:val="Prrafodelista"/>
+        <w:numPr>
+          <w:ilvl w:val="1"/>
+          <w:numId w:val="1"/>
+        </w:numPr>
+      </w:pPr>
+      <w:r>
+        <w:t xml:space="preserve">Pedir al usuario </w:t>
+      </w:r>
+      <w:proofErr w:type="gramStart"/>
+      <w:r>
+        <w:t>2 ,</w:t>
+      </w:r>
+      <w:proofErr w:type="gramEnd"/>
+      <w:r>
+        <w:t xml:space="preserve"> que ingrese los operados lógicos </w:t>
+      </w:r>
+    </w:p>
+    <w:p>
+      <w:pPr>
+        <w:pStyle w:val="Prrafodelista"/>
+        <w:numPr>
+          <w:ilvl w:val="1"/>
+          <w:numId w:val="1"/>
+        </w:numPr>
+      </w:pPr>
+      <w:r>
+        <w:t xml:space="preserve">Si los valores que ingreso fueron </w:t>
+      </w:r>
+      <w:proofErr w:type="gramStart"/>
+      <w:r>
+        <w:t>correctos ,</w:t>
+      </w:r>
+      <w:proofErr w:type="gramEnd"/>
+      <w:r>
+        <w:t xml:space="preserve"> imprimir </w:t>
+      </w:r>
+      <w:r>
+        <w:t xml:space="preserve">el numero de movimientos y el tiempo </w:t>
+      </w:r>
+      <w:proofErr w:type="gramStart"/>
+      <w:r>
+        <w:t>realizado ,</w:t>
+      </w:r>
+      <w:proofErr w:type="gramEnd"/>
+      <w:r>
+        <w:t xml:space="preserve"> y un mensaje de “lo lograste”</w:t>
+      </w:r>
+    </w:p>
+    <w:p>
+      <w:pPr>
+        <w:pStyle w:val="Prrafodelista"/>
+        <w:numPr>
+          <w:ilvl w:val="1"/>
+          <w:numId w:val="1"/>
+        </w:numPr>
+      </w:pPr>
+      <w:r>
+        <w:t xml:space="preserve">Si </w:t>
+      </w:r>
+      <w:proofErr w:type="gramStart"/>
+      <w:r>
+        <w:t>no ,</w:t>
+      </w:r>
+      <w:proofErr w:type="gramEnd"/>
+      <w:r>
+        <w:t xml:space="preserve"> imprimir los operadores ingresados son incorrectos</w:t>
+      </w:r>
+    </w:p>
+    <w:p>
+      <w:pPr>
+        <w:pStyle w:val="Prrafodelista"/>
+        <w:numPr>
+          <w:ilvl w:val="1"/>
+          <w:numId w:val="1"/>
+        </w:numPr>
+      </w:pPr>
+      <w:r>
+        <w:t xml:space="preserve">Volver a pedir al usuario 2 los operadores lógicos </w:t>
+      </w:r>
+    </w:p>
+    <w:p>
+      <w:pPr>
+        <w:pStyle w:val="Prrafodelista"/>
+        <w:numPr>
+          <w:ilvl w:val="1"/>
+          <w:numId w:val="1"/>
+        </w:numPr>
+      </w:pPr>
+      <w:r>
+        <w:t xml:space="preserve">Si el usuario llega al limite del contador de </w:t>
+      </w:r>
+      <w:proofErr w:type="gramStart"/>
+      <w:r>
+        <w:t>movimientos ,</w:t>
+      </w:r>
+      <w:proofErr w:type="gramEnd"/>
+      <w:r>
+        <w:t xml:space="preserve"> o llega al limite de tiempo (usar un hilo de tiempo), </w:t>
+      </w:r>
+    </w:p>
+    <w:p>
+      <w:pPr>
+        <w:pStyle w:val="Prrafodelista"/>
+        <w:numPr>
+          <w:ilvl w:val="1"/>
+          <w:numId w:val="1"/>
+        </w:numPr>
+      </w:pPr>
+      <w:r>
+        <w:t xml:space="preserve">Imprimir el numero de </w:t>
+      </w:r>
+      <w:proofErr w:type="gramStart"/>
+      <w:r>
+        <w:t>movimientos ,</w:t>
+      </w:r>
+      <w:proofErr w:type="gramEnd"/>
+      <w:r>
+        <w:t xml:space="preserve"> imprimir la respuesta </w:t>
+      </w:r>
+      <w:proofErr w:type="gramStart"/>
+      <w:r>
+        <w:t>correcta  de</w:t>
+      </w:r>
+      <w:proofErr w:type="gramEnd"/>
+      <w:r>
+        <w:t xml:space="preserve"> operadores y el tiempo utilizado. </w:t>
+      </w:r>
+    </w:p>
+    <w:p>
+      <w:r>
+        <w:t>(agregar dificultad</w:t>
+      </w:r>
+      <w:proofErr w:type="gramStart"/>
+      <w:r>
+        <w:t>) ,</w:t>
+      </w:r>
+      <w:proofErr w:type="gramEnd"/>
+      <w:r>
+        <w:t xml:space="preserve"> haciendo recursivo el </w:t>
+      </w:r>
+      <w:proofErr w:type="gramStart"/>
+      <w:r>
+        <w:t>programa ,</w:t>
+      </w:r>
+      <w:proofErr w:type="gramEnd"/>
+      <w:r>
+        <w:t xml:space="preserve"> usar una </w:t>
+      </w:r>
+      <w:proofErr w:type="gramStart"/>
+      <w:r>
+        <w:t>interfaz ,</w:t>
+      </w:r>
+      <w:proofErr w:type="gramEnd"/>
+      <w:r>
+        <w:t xml:space="preserve"> </w:t>
+      </w:r>
+    </w:p>
+    <w:p>
+      <w:r>
+        <w:t xml:space="preserve">Librerías que busque </w:t>
+      </w:r>
+    </w:p>
+    <w:p>
+      <w:r>
+        <w:lastRenderedPageBreak/>
+        <w:drawing>
+          <wp:inline distT="0" distB="0" distL="0" distR="0" wp14:anchorId="58DDAF0D" wp14:editId="5002A9F3">
+            <wp:extent cx="5612130" cy="3006090"/>
+            <wp:effectExtent l="0" t="0" r="7620" b="3810"/>
+            <wp:docPr id="256297739" name="Imagen 1"/>
+            <wp:cNvGraphicFramePr>
+              <a:graphicFrameLocks xmlns:a="http://schemas.openxmlformats.org/drawingml/2006/main" noChangeAspect="1"/>
+            </wp:cNvGraphicFramePr>
+            <a:graphic xmlns:a="http://schemas.openxmlformats.org/drawingml/2006/main">
+              <a:graphicData uri="http://schemas.openxmlformats.org/drawingml/2006/picture">
+                <pic:pic xmlns:pic="http://schemas.openxmlformats.org/drawingml/2006/picture">
+                  <pic:nvPicPr>
+                    <pic:cNvPr id="256297739" name=""/>
+                    <pic:cNvPicPr/>
+                  </pic:nvPicPr>
+                  <pic:blipFill>
+                    <a:blip r:embed="rId5"/>
+                    <a:stretch>
+                      <a:fillRect/>
+                    </a:stretch>
+                  </pic:blipFill>
+                  <pic:spPr>
+                    <a:xfrm>
+                      <a:off x="0" y="0"/>
+                      <a:ext cx="5612130" cy="3006090"/>
+                    </a:xfrm>
+                    <a:prstGeom prst="rect">
+                      <a:avLst/>
+                    </a:prstGeom>
+                  </pic:spPr>
+                </pic:pic>
+              </a:graphicData>
+            </a:graphic>
+          </wp:inline>
+        </w:drawing>
+      </w:r>
+    </w:p>
+    <w:p>
       <w:proofErr w:type="spellStart"/>
       <w:r>
-        <w:t>bicondicional</w:t>
+        <w:t>P</w:t>
+      </w:r>
+      <w:r>
+        <w:t>ySimple</w:t>
       </w:r>
       <w:proofErr w:type="spellEnd"/>
       <w:r>
-        <w:t xml:space="preserve">: Si tanto p como q son 0 o 1 es verdadero, de lo contrario es falso </w:t>
-      </w:r>
-    </w:p>
-    <w:p>
-      <w:pPr>
-        <w:pStyle w:val="Prrafodelista"/>
-        <w:numPr>
-          <w:ilvl w:val="1"/>
-          <w:numId w:val="1"/>
-        </w:numPr>
-      </w:pPr>
-      <w:r>
-        <w:t>Para XOR: Si p=</w:t>
-      </w:r>
-      <w:proofErr w:type="gramStart"/>
-      <w:r>
-        <w:t>1,q</w:t>
-      </w:r>
-      <w:proofErr w:type="gramEnd"/>
-      <w:r>
-        <w:t>=0 o p=0,q=1 es verdadero, de lo contrario, es falso</w:t>
-      </w:r>
-    </w:p>
-    <w:p>
-      <w:pPr>
-        <w:pStyle w:val="Prrafodelista"/>
-        <w:numPr>
-          <w:ilvl w:val="1"/>
-          <w:numId w:val="1"/>
-        </w:numPr>
-      </w:pPr>
-      <w:r>
-        <w:t>Imprimir resultado</w:t>
-      </w:r>
-      <w:bookmarkStart w:id="0" w:name="_GoBack"/>
-      <w:bookmarkEnd w:id="0"/>
+        <w:t xml:space="preserve"> </w:t>
+      </w:r>
+      <w:proofErr w:type="spellStart"/>
+      <w:proofErr w:type="gramStart"/>
+      <w:r>
+        <w:t>Gui</w:t>
+      </w:r>
+      <w:proofErr w:type="spellEnd"/>
+      <w:r>
+        <w:t xml:space="preserve"> :Existen</w:t>
+      </w:r>
+      <w:proofErr w:type="gramEnd"/>
+      <w:r>
+        <w:t xml:space="preserve"> dos </w:t>
+      </w:r>
+      <w:proofErr w:type="gramStart"/>
+      <w:r>
+        <w:t>versiones ,</w:t>
+      </w:r>
+      <w:proofErr w:type="gramEnd"/>
+      <w:r>
+        <w:t xml:space="preserve"> una gratis que limita ciertas </w:t>
+      </w:r>
+      <w:proofErr w:type="gramStart"/>
+      <w:r>
+        <w:t>cosas ,</w:t>
+      </w:r>
+      <w:proofErr w:type="gramEnd"/>
+      <w:r>
+        <w:t xml:space="preserve"> pero para nuestro proyecto es buena idea, se aprende en poco </w:t>
+      </w:r>
+      <w:proofErr w:type="gramStart"/>
+      <w:r>
+        <w:t>rato ,</w:t>
+      </w:r>
+      <w:proofErr w:type="gramEnd"/>
+      <w:r>
+        <w:t xml:space="preserve"> se pueden consultar muy </w:t>
+      </w:r>
+      <w:proofErr w:type="gramStart"/>
+      <w:r>
+        <w:t>rápidamente ,</w:t>
+      </w:r>
+      <w:proofErr w:type="gramEnd"/>
+      <w:r>
+        <w:t xml:space="preserve"> lo que aparece arriba es para instalar en la </w:t>
+      </w:r>
+      <w:proofErr w:type="gramStart"/>
+      <w:r>
+        <w:t>terminal .</w:t>
+      </w:r>
+      <w:proofErr w:type="gramEnd"/>
+      <w:r>
+        <w:t xml:space="preserve">  </w:t>
+      </w:r>
+      <w:hyperlink r:id="rId6" w:history="1">
+        <w:r>
+          <w:rPr>
+            <w:rStyle w:val="Hipervnculo"/>
+          </w:rPr>
+          <w:t>https://www.pysimplegui.com/</w:t>
+        </w:r>
+      </w:hyperlink>
+      <w:r>
+        <w:t xml:space="preserve">   </w:t>
+      </w:r>
+      <w:r>
+        <w:drawing>
+          <wp:inline distT="0" distB="0" distL="0" distR="0" wp14:anchorId="54B37ACB" wp14:editId="7BDE62F3">
+            <wp:extent cx="5612130" cy="3403600"/>
+            <wp:effectExtent l="0" t="0" r="7620" b="6350"/>
+            <wp:docPr id="1861855034" name="Imagen 1"/>
+            <wp:cNvGraphicFramePr>
+              <a:graphicFrameLocks xmlns:a="http://schemas.openxmlformats.org/drawingml/2006/main" noChangeAspect="1"/>
+            </wp:cNvGraphicFramePr>
+            <a:graphic xmlns:a="http://schemas.openxmlformats.org/drawingml/2006/main">
+              <a:graphicData uri="http://schemas.openxmlformats.org/drawingml/2006/picture">
+                <pic:pic xmlns:pic="http://schemas.openxmlformats.org/drawingml/2006/picture">
+                  <pic:nvPicPr>
+                    <pic:cNvPr id="1861855034" name=""/>
+                    <pic:cNvPicPr/>
+                  </pic:nvPicPr>
+                  <pic:blipFill>
+                    <a:blip r:embed="rId7"/>
+                    <a:stretch>
+                      <a:fillRect/>
+                    </a:stretch>
+                  </pic:blipFill>
+                  <pic:spPr>
+                    <a:xfrm>
+                      <a:off x="0" y="0"/>
+                      <a:ext cx="5612130" cy="3403600"/>
+                    </a:xfrm>
+                    <a:prstGeom prst="rect">
+                      <a:avLst/>
+                    </a:prstGeom>
+                  </pic:spPr>
+                </pic:pic>
+              </a:graphicData>
+            </a:graphic>
+          </wp:inline>
+        </w:drawing>
+      </w:r>
+    </w:p>
+    <w:p/>
+    <w:p/>
+    <w:p/>
+    <w:p/>
+    <w:p>
+      <w:pPr>
+        <w:rPr>
+          <w:b/>
+          <w:bCs/>
+        </w:rPr>
+      </w:pPr>
+      <w:r>
+        <w:lastRenderedPageBreak/>
+        <w:t>2:</w:t>
+      </w:r>
+      <w:r>
+        <w:rPr>
+          <w:rFonts w:ascii="Montserrat" w:eastAsia="Times New Roman" w:hAnsi="Montserrat" w:cs="Times New Roman"/>
+          <w:b/>
+          <w:bCs/>
+          <w:color w:val="2C2C2C"/>
+          <w:spacing w:val="-5"/>
+          <w:kern w:val="36"/>
+          <w:sz w:val="48"/>
+          <w:szCs w:val="48"/>
+          <w:lang w:eastAsia="es-MX"/>
+        </w:rPr>
+        <w:t xml:space="preserve"> </w:t>
+      </w:r>
+      <w:r>
+        <w:rPr>
+          <w:b/>
+          <w:bCs/>
+        </w:rPr>
+        <w:t>PyQt5</w:t>
+      </w:r>
+      <w:r>
+        <w:rPr>
+          <w:b/>
+          <w:bCs/>
+        </w:rPr>
+        <w:t xml:space="preserve">: Esta segunda </w:t>
+      </w:r>
+      <w:proofErr w:type="gramStart"/>
+      <w:r>
+        <w:rPr>
+          <w:b/>
+          <w:bCs/>
+        </w:rPr>
+        <w:t>librería ,</w:t>
+      </w:r>
+      <w:proofErr w:type="gramEnd"/>
+      <w:r>
+        <w:rPr>
+          <w:b/>
+          <w:bCs/>
+        </w:rPr>
+        <w:t xml:space="preserve"> requiere un poco </w:t>
+      </w:r>
+      <w:proofErr w:type="spellStart"/>
+      <w:r>
+        <w:rPr>
+          <w:b/>
+          <w:bCs/>
+        </w:rPr>
+        <w:t>mas</w:t>
+      </w:r>
+      <w:proofErr w:type="spellEnd"/>
+      <w:r>
+        <w:rPr>
+          <w:b/>
+          <w:bCs/>
+        </w:rPr>
+        <w:t xml:space="preserve"> de investigación para sus funciones y </w:t>
+      </w:r>
+      <w:proofErr w:type="gramStart"/>
+      <w:r>
+        <w:rPr>
+          <w:b/>
+          <w:bCs/>
+        </w:rPr>
+        <w:t>widgets .</w:t>
+      </w:r>
+      <w:proofErr w:type="gramEnd"/>
+      <w:r>
+        <w:rPr>
+          <w:b/>
+          <w:bCs/>
+        </w:rPr>
+        <w:t xml:space="preserve"> </w:t>
+      </w:r>
+    </w:p>
+    <w:p>
+      <w:pPr>
+        <w:rPr>
+          <w:b/>
+          <w:bCs/>
+        </w:rPr>
+      </w:pPr>
+      <w:r>
+        <w:rPr>
+          <w:b/>
+          <w:bCs/>
+        </w:rPr>
+        <w:drawing>
+          <wp:inline distT="0" distB="0" distL="0" distR="0" wp14:anchorId="460A492A" wp14:editId="2C9AF313">
+            <wp:extent cx="5612130" cy="3260090"/>
+            <wp:effectExtent l="0" t="0" r="7620" b="0"/>
+            <wp:docPr id="30642438" name="Imagen 1"/>
+            <wp:cNvGraphicFramePr>
+              <a:graphicFrameLocks xmlns:a="http://schemas.openxmlformats.org/drawingml/2006/main" noChangeAspect="1"/>
+            </wp:cNvGraphicFramePr>
+            <a:graphic xmlns:a="http://schemas.openxmlformats.org/drawingml/2006/main">
+              <a:graphicData uri="http://schemas.openxmlformats.org/drawingml/2006/picture">
+                <pic:pic xmlns:pic="http://schemas.openxmlformats.org/drawingml/2006/picture">
+                  <pic:nvPicPr>
+                    <pic:cNvPr id="30642438" name=""/>
+                    <pic:cNvPicPr/>
+                  </pic:nvPicPr>
+                  <pic:blipFill>
+                    <a:blip r:embed="rId8"/>
+                    <a:stretch>
+                      <a:fillRect/>
+                    </a:stretch>
+                  </pic:blipFill>
+                  <pic:spPr>
+                    <a:xfrm>
+                      <a:off x="0" y="0"/>
+                      <a:ext cx="5612130" cy="3260090"/>
+                    </a:xfrm>
+                    <a:prstGeom prst="rect">
+                      <a:avLst/>
+                    </a:prstGeom>
+                  </pic:spPr>
+                </pic:pic>
+              </a:graphicData>
+            </a:graphic>
+          </wp:inline>
+        </w:drawing>
+      </w:r>
+    </w:p>
+    <w:p>
+      <w:pPr>
+        <w:rPr>
+          <w:b/>
+          <w:bCs/>
+        </w:rPr>
+      </w:pPr>
+      <w:hyperlink r:id="rId9" w:history="1">
+        <w:r>
+          <w:rPr>
+            <w:rStyle w:val="Hipervnculo"/>
+            <w:b/>
+            <w:bCs/>
+          </w:rPr>
+          <w:t>https://www.pythonguis.com/tutorials/creating-your-first-pyqt-window/</w:t>
+        </w:r>
+      </w:hyperlink>
+    </w:p>
+    <w:p>
+      <w:pPr>
+        <w:rPr>
+          <w:b/>
+          <w:bCs/>
+        </w:rPr>
+      </w:pPr>
+    </w:p>
+    <w:p>
+      <w:pPr>
+        <w:rPr>
+          <w:b/>
+          <w:bCs/>
+        </w:rPr>
+      </w:pPr>
+      <w:proofErr w:type="gramStart"/>
+      <w:r>
+        <w:rPr>
+          <w:b/>
+          <w:bCs/>
+        </w:rPr>
+        <w:t>3:TKINTER</w:t>
+      </w:r>
+      <w:proofErr w:type="gramEnd"/>
+      <w:r>
+        <w:rPr>
+          <w:b/>
+          <w:bCs/>
+        </w:rPr>
+        <w:t xml:space="preserve">, es de las mas comunes y ya viene incluido en </w:t>
+      </w:r>
+      <w:proofErr w:type="gramStart"/>
+      <w:r>
+        <w:rPr>
+          <w:b/>
+          <w:bCs/>
+        </w:rPr>
+        <w:t>Python .</w:t>
+      </w:r>
+      <w:proofErr w:type="gramEnd"/>
+      <w:r>
+        <w:rPr>
+          <w:b/>
+          <w:bCs/>
+        </w:rPr>
+        <w:t xml:space="preserve"> </w:t>
+      </w:r>
+    </w:p>
+    <w:p>
+      <w:pPr>
+        <w:rPr>
+          <w:b/>
+          <w:bCs/>
+        </w:rPr>
+      </w:pPr>
+      <w:r>
+        <w:rPr>
+          <w:b/>
+          <w:bCs/>
+        </w:rPr>
+        <w:lastRenderedPageBreak/>
+        <w:drawing>
+          <wp:inline distT="0" distB="0" distL="0" distR="0" wp14:anchorId="13A4F9A6" wp14:editId="3B0A0389">
+            <wp:extent cx="3639058" cy="5182323"/>
+            <wp:effectExtent l="0" t="0" r="0" b="0"/>
+            <wp:docPr id="488155608" name="Imagen 1"/>
+            <wp:cNvGraphicFramePr>
+              <a:graphicFrameLocks xmlns:a="http://schemas.openxmlformats.org/drawingml/2006/main" noChangeAspect="1"/>
+            </wp:cNvGraphicFramePr>
+            <a:graphic xmlns:a="http://schemas.openxmlformats.org/drawingml/2006/main">
+              <a:graphicData uri="http://schemas.openxmlformats.org/drawingml/2006/picture">
+                <pic:pic xmlns:pic="http://schemas.openxmlformats.org/drawingml/2006/picture">
+                  <pic:nvPicPr>
+                    <pic:cNvPr id="488155608" name=""/>
+                    <pic:cNvPicPr/>
+                  </pic:nvPicPr>
+                  <pic:blipFill>
+                    <a:blip r:embed="rId10"/>
+                    <a:stretch>
+                      <a:fillRect/>
+                    </a:stretch>
+                  </pic:blipFill>
+                  <pic:spPr>
+                    <a:xfrm>
+                      <a:off x="0" y="0"/>
+                      <a:ext cx="3639058" cy="5182323"/>
+                    </a:xfrm>
+                    <a:prstGeom prst="rect">
+                      <a:avLst/>
+                    </a:prstGeom>
+                  </pic:spPr>
+                </pic:pic>
+              </a:graphicData>
+            </a:graphic>
+          </wp:inline>
+        </w:drawing>
+      </w:r>
+    </w:p>
+    <w:p/>
+    <w:p>
+      <w:proofErr w:type="spellStart"/>
+      <w:proofErr w:type="gramStart"/>
+      <w:r>
+        <w:t>Conclusion:En</w:t>
+      </w:r>
+      <w:proofErr w:type="spellEnd"/>
+      <w:proofErr w:type="gramEnd"/>
+      <w:r>
+        <w:t xml:space="preserve"> recomendaciones de videos y </w:t>
+      </w:r>
+      <w:proofErr w:type="gramStart"/>
+      <w:r>
+        <w:t>copilot  ,</w:t>
+      </w:r>
+      <w:proofErr w:type="gramEnd"/>
+      <w:r>
+        <w:t xml:space="preserve"> Py simple </w:t>
+      </w:r>
+      <w:proofErr w:type="spellStart"/>
+      <w:proofErr w:type="gramStart"/>
+      <w:r>
+        <w:t>Gui</w:t>
+      </w:r>
+      <w:proofErr w:type="spellEnd"/>
+      <w:r>
+        <w:t xml:space="preserve"> ,</w:t>
+      </w:r>
+      <w:proofErr w:type="gramEnd"/>
+      <w:r>
+        <w:t xml:space="preserve"> es una librería que puede ser </w:t>
+      </w:r>
+      <w:proofErr w:type="spellStart"/>
+      <w:r>
+        <w:t>mas</w:t>
+      </w:r>
+      <w:proofErr w:type="spellEnd"/>
+      <w:r>
+        <w:t xml:space="preserve"> fácil de </w:t>
+      </w:r>
+      <w:proofErr w:type="gramStart"/>
+      <w:r>
+        <w:t>usar ,</w:t>
+      </w:r>
+      <w:proofErr w:type="gramEnd"/>
+      <w:r>
+        <w:t xml:space="preserve">” </w:t>
+      </w:r>
+      <w:r>
+        <w:t xml:space="preserve">si ya tienes el código y solo quieres agregar esa interfaz gráfica, con </w:t>
+      </w:r>
+      <w:proofErr w:type="spellStart"/>
+      <w:r>
+        <w:t>PySimpleGUI</w:t>
+      </w:r>
+      <w:proofErr w:type="spellEnd"/>
+      <w:r>
+        <w:t xml:space="preserve"> es básicamente definir un </w:t>
+      </w:r>
+      <w:proofErr w:type="spellStart"/>
+      <w:r>
+        <w:t>layout</w:t>
+      </w:r>
+      <w:proofErr w:type="spellEnd"/>
+      <w:r>
+        <w:t xml:space="preserve"> con los elementos que necesitas (botones, campos de texto, etc.) y luego correr el </w:t>
+      </w:r>
+      <w:proofErr w:type="spellStart"/>
+      <w:r>
+        <w:t>loop</w:t>
+      </w:r>
+      <w:proofErr w:type="spellEnd"/>
+      <w:r>
+        <w:t xml:space="preserve"> de eventos para manejar las interacciones del usuario. En palabras simples, vas colocando los bloques como si armaras un LEGO, y en nada ya tienes tu ventana funcionando.</w:t>
+      </w:r>
+      <w:r>
+        <w:t>”</w:t>
+      </w:r>
     </w:p>
     <w:p>
       <w:pPr>
@@ -394,9 +1313,30 @@
         <w:pStyle w:val="Prrafodelista"/>
         <w:ind w:left="1092"/>
       </w:pPr>
-      <w:r>
-        <w:t xml:space="preserve"> </w:t>
-      </w:r>
+    </w:p>
+    <w:p>
+      <w:pPr>
+        <w:pStyle w:val="Prrafodelista"/>
+        <w:ind w:left="1092"/>
+      </w:pPr>
+    </w:p>
+    <w:p>
+      <w:pPr>
+        <w:pStyle w:val="Prrafodelista"/>
+        <w:ind w:left="1092"/>
+      </w:pPr>
+    </w:p>
+    <w:p>
+      <w:pPr>
+        <w:pStyle w:val="Prrafodelista"/>
+        <w:ind w:left="1092"/>
+      </w:pPr>
+    </w:p>
+    <w:p>
+      <w:pPr>
+        <w:pStyle w:val="Prrafodelista"/>
+        <w:ind w:left="1092"/>
+      </w:pPr>
     </w:p>
     <w:sectPr>
       <w:pgSz w:w="12240" w:h="15840"/>
@@ -409,7 +1349,7 @@
 </file>
 
 <file path=word/numbering.xml><?xml version="1.0" encoding="utf-8"?>
-<w:numbering xmlns:wpc="http://schemas.microsoft.com/office/word/2010/wordprocessingCanvas" xmlns:cx="http://schemas.microsoft.com/office/drawing/2014/chartex" xmlns:mc="http://schemas.openxmlformats.org/markup-compatibility/2006" xmlns:o="urn:schemas-microsoft-com:office:office" xmlns:r="http://schemas.openxmlformats.org/officeDocument/2006/relationships" xmlns:m="http://schemas.openxmlformats.org/officeDocument/2006/math" xmlns:v="urn:schemas-microsoft-com:vml" xmlns:wp14="http://schemas.microsoft.com/office/word/2010/wordprocessingDrawing" xmlns:wp="http://schemas.openxmlformats.org/drawingml/2006/wordprocessingDrawing" xmlns:w10="urn:schemas-microsoft-com:office:word" xmlns:w="http://schemas.openxmlformats.org/wordprocessingml/2006/main" xmlns:w14="http://schemas.microsoft.com/office/word/2010/wordml" xmlns:w15="http://schemas.microsoft.com/office/word/2012/wordml" xmlns:w16se="http://schemas.microsoft.com/office/word/2015/wordml/symex" xmlns:wpg="http://schemas.microsoft.com/office/word/2010/wordprocessingGroup" xmlns:wpi="http://schemas.microsoft.com/office/word/2010/wordprocessingInk" xmlns:wne="http://schemas.microsoft.com/office/word/2006/wordml" xmlns:wps="http://schemas.microsoft.com/office/word/2010/wordprocessingShape" mc:Ignorable="w14 w15 w16se wp14">
+<w:numbering xmlns:wpc="http://schemas.microsoft.com/office/word/2010/wordprocessingCanvas" xmlns:cx="http://schemas.microsoft.com/office/drawing/2014/chartex" xmlns:cx1="http://schemas.microsoft.com/office/drawing/2015/9/8/chartex" xmlns:cx2="http://schemas.microsoft.com/office/drawing/2015/10/21/chartex" xmlns:cx3="http://schemas.microsoft.com/office/drawing/2016/5/9/chartex" xmlns:cx4="http://schemas.microsoft.com/office/drawing/2016/5/10/chartex" xmlns:cx5="http://schemas.microsoft.com/office/drawing/2016/5/11/chartex" xmlns:cx6="http://schemas.microsoft.com/office/drawing/2016/5/12/chartex" xmlns:cx7="http://schemas.microsoft.com/office/drawing/2016/5/13/chartex" xmlns:cx8="http://schemas.microsoft.com/office/drawing/2016/5/14/chartex" xmlns:mc="http://schemas.openxmlformats.org/markup-compatibility/2006" xmlns:aink="http://schemas.microsoft.com/office/drawing/2016/ink" xmlns:am3d="http://schemas.microsoft.com/office/drawing/2017/model3d" xmlns:o="urn:schemas-microsoft-com:office:office" xmlns:oel="http://schemas.microsoft.com/office/2019/extlst" xmlns:r="http://schemas.openxmlformats.org/officeDocument/2006/relationships" xmlns:m="http://schemas.openxmlformats.org/officeDocument/2006/math" xmlns:v="urn:schemas-microsoft-com:vml" xmlns:wp14="http://schemas.microsoft.com/office/word/2010/wordprocessingDrawing" xmlns:wp="http://schemas.openxmlformats.org/drawingml/2006/wordprocessingDrawing" xmlns:w10="urn:schemas-microsoft-com:office:word" xmlns:w="http://schemas.openxmlformats.org/wordprocessingml/2006/main" xmlns:w14="http://schemas.microsoft.com/office/word/2010/wordml" xmlns:w15="http://schemas.microsoft.com/office/word/2012/wordml" xmlns:w16cex="http://schemas.microsoft.com/office/word/2018/wordml/cex" xmlns:w16cid="http://schemas.microsoft.com/office/word/2016/wordml/cid" xmlns:w16="http://schemas.microsoft.com/office/word/2018/wordml" xmlns:w16du="http://schemas.microsoft.com/office/word/2023/wordml/word16du" xmlns:w16sdtdh="http://schemas.microsoft.com/office/word/2020/wordml/sdtdatahash" xmlns:w16sdtfl="http://schemas.microsoft.com/office/word/2024/wordml/sdtformatlock" xmlns:w16se="http://schemas.microsoft.com/office/word/2015/wordml/symex" xmlns:wpg="http://schemas.microsoft.com/office/word/2010/wordprocessingGroup" xmlns:wpi="http://schemas.microsoft.com/office/word/2010/wordprocessingInk" xmlns:wne="http://schemas.microsoft.com/office/word/2006/wordml" xmlns:wps="http://schemas.microsoft.com/office/word/2010/wordprocessingShape" mc:Ignorable="w14 w15 w16se w16cid w16 w16cex w16sdtdh w16sdtfl w16du wp14">
   <w:abstractNum w:abstractNumId="0" w15:restartNumberingAfterBreak="0">
     <w:nsid w:val="16237F7A"/>
     <w:multiLevelType w:val="multilevel"/>
@@ -531,14 +1471,14 @@
       </w:rPr>
     </w:lvl>
   </w:abstractNum>
-  <w:num w:numId="1">
+  <w:num w:numId="1" w16cid:durableId="367409909">
     <w:abstractNumId w:val="0"/>
   </w:num>
 </w:numbering>
 </file>
 
 <file path=word/styles.xml><?xml version="1.0" encoding="utf-8"?>
-<w:styles xmlns:mc="http://schemas.openxmlformats.org/markup-compatibility/2006" xmlns:r="http://schemas.openxmlformats.org/officeDocument/2006/relationships" xmlns:w="http://schemas.openxmlformats.org/wordprocessingml/2006/main" xmlns:w14="http://schemas.microsoft.com/office/word/2010/wordml" xmlns:w15="http://schemas.microsoft.com/office/word/2012/wordml" xmlns:w16se="http://schemas.microsoft.com/office/word/2015/wordml/symex" mc:Ignorable="w14 w15 w16se">
+<w:styles xmlns:mc="http://schemas.openxmlformats.org/markup-compatibility/2006" xmlns:r="http://schemas.openxmlformats.org/officeDocument/2006/relationships" xmlns:w="http://schemas.openxmlformats.org/wordprocessingml/2006/main" xmlns:w14="http://schemas.microsoft.com/office/word/2010/wordml" xmlns:w15="http://schemas.microsoft.com/office/word/2012/wordml" xmlns:w16cex="http://schemas.microsoft.com/office/word/2018/wordml/cex" xmlns:w16cid="http://schemas.microsoft.com/office/word/2016/wordml/cid" xmlns:w16="http://schemas.microsoft.com/office/word/2018/wordml" xmlns:w16du="http://schemas.microsoft.com/office/word/2023/wordml/word16du" xmlns:w16sdtdh="http://schemas.microsoft.com/office/word/2020/wordml/sdtdatahash" xmlns:w16sdtfl="http://schemas.microsoft.com/office/word/2024/wordml/sdtformatlock" xmlns:w16se="http://schemas.microsoft.com/office/word/2015/wordml/symex" mc:Ignorable="w14 w15 w16se w16cid w16 w16cex w16sdtdh w16sdtfl w16du">
   <w:docDefaults>
     <w:rPrDefault>
       <w:rPr>
@@ -554,7 +1494,7 @@
       </w:pPr>
     </w:pPrDefault>
   </w:docDefaults>
-  <w:latentStyles w:defLockedState="0" w:defUIPriority="99" w:defSemiHidden="0" w:defUnhideWhenUsed="0" w:defQFormat="0" w:count="371">
+  <w:latentStyles w:defLockedState="0" w:defUIPriority="99" w:defSemiHidden="0" w:defUnhideWhenUsed="0" w:defQFormat="0" w:count="376">
     <w:lsdException w:name="Normal" w:uiPriority="0" w:qFormat="1"/>
     <w:lsdException w:name="heading 1" w:uiPriority="9" w:qFormat="1"/>
     <w:lsdException w:name="heading 2" w:semiHidden="1" w:uiPriority="9" w:unhideWhenUsed="1" w:qFormat="1"/>
@@ -926,15 +1866,40 @@
     <w:lsdException w:name="List Table 5 Dark Accent 6" w:uiPriority="50"/>
     <w:lsdException w:name="List Table 6 Colorful Accent 6" w:uiPriority="51"/>
     <w:lsdException w:name="List Table 7 Colorful Accent 6" w:uiPriority="52"/>
+    <w:lsdException w:name="Mention" w:semiHidden="1" w:unhideWhenUsed="1"/>
+    <w:lsdException w:name="Smart Hyperlink" w:semiHidden="1" w:unhideWhenUsed="1"/>
+    <w:lsdException w:name="Hashtag" w:semiHidden="1" w:unhideWhenUsed="1"/>
+    <w:lsdException w:name="Unresolved Mention" w:semiHidden="1" w:unhideWhenUsed="1"/>
+    <w:lsdException w:name="Smart Link" w:semiHidden="1" w:unhideWhenUsed="1"/>
   </w:latentStyles>
   <w:style w:type="paragraph" w:default="1" w:styleId="Normal">
     <w:name w:val="Normal"/>
     <w:qFormat/>
   </w:style>
+  <w:style w:type="paragraph" w:styleId="Ttulo1">
+    <w:name w:val="heading 1"/>
+    <w:basedOn w:val="Normal"/>
+    <w:next w:val="Normal"/>
+    <w:link w:val="Ttulo1Car"/>
+    <w:uiPriority w:val="9"/>
+    <w:qFormat/>
+    <w:rsid w:val="0006741E"/>
+    <w:pPr>
+      <w:keepNext/>
+      <w:keepLines/>
+      <w:spacing w:before="240" w:after="0"/>
+      <w:outlineLvl w:val="0"/>
+    </w:pPr>
+    <w:rPr>
+      <w:rFonts w:asciiTheme="majorHAnsi" w:eastAsiaTheme="majorEastAsia" w:hAnsiTheme="majorHAnsi" w:cstheme="majorBidi"/>
+      <w:color w:val="2E74B5" w:themeColor="accent1" w:themeShade="BF"/>
+      <w:sz w:val="32"/>
+      <w:szCs w:val="32"/>
+    </w:rPr>
+  </w:style>
   <w:style w:type="character" w:default="1" w:styleId="Fuentedeprrafopredeter">
     <w:name w:val="Default Paragraph Font"/>
     <w:uiPriority w:val="1"/>
-    <w:semiHidden/>
     <w:unhideWhenUsed/>
   </w:style>
   <w:style w:type="table" w:default="1" w:styleId="Tablanormal">
@@ -968,6 +1933,42 @@
       <w:ind w:left="720"/>
       <w:contextualSpacing/>
     </w:pPr>
+  </w:style>
+  <w:style w:type="character" w:styleId="Hipervnculo">
+    <w:name w:val="Hyperlink"/>
+    <w:basedOn w:val="Fuentedeprrafopredeter"/>
+    <w:uiPriority w:val="99"/>
+    <w:unhideWhenUsed/>
+    <w:rsid w:val="0006741E"/>
+    <w:rPr>
+      <w:color w:val="0563C1" w:themeColor="hyperlink"/>
+      <w:u w:val="single"/>
+    </w:rPr>
+  </w:style>
+  <w:style w:type="character" w:styleId="Mencinsinresolver">
+    <w:name w:val="Unresolved Mention"/>
+    <w:basedOn w:val="Fuentedeprrafopredeter"/>
+    <w:uiPriority w:val="99"/>
+    <w:semiHidden/>
+    <w:unhideWhenUsed/>
+    <w:rsid w:val="0006741E"/>
+    <w:rPr>
+      <w:color w:val="605E5C"/>
+      <w:shd w:val="clear" w:color="auto" w:fill="E1DFDD"/>
+    </w:rPr>
+  </w:style>
+  <w:style w:type="character" w:customStyle="1" w:styleId="Ttulo1Car">
+    <w:name w:val="Título 1 Car"/>
+    <w:basedOn w:val="Fuentedeprrafopredeter"/>
+    <w:link w:val="Ttulo1"/>
+    <w:uiPriority w:val="9"/>
+    <w:rsid w:val="0006741E"/>
+    <w:rPr>
+      <w:rFonts w:asciiTheme="majorHAnsi" w:eastAsiaTheme="majorEastAsia" w:hAnsiTheme="majorHAnsi" w:cstheme="majorBidi"/>
+      <w:color w:val="2E74B5" w:themeColor="accent1" w:themeShade="BF"/>
+      <w:sz w:val="32"/>
+      <w:szCs w:val="32"/>
+    </w:rPr>
   </w:style>
 </w:styles>
 </file>

</xml_diff>